<commit_message>
Charte DGID et statuts renforces
</commit_message>
<xml_diff>
--- a/guide_agent.docx
+++ b/guide_agent.docx
@@ -338,6 +338,21 @@
           <w:sz w:val="24"/>
         </w:rPr>
       </w:pPr>
+      <w:r>
+        <w:rPr>
+          <w:sz w:val="24"/>
+        </w:rPr>
+        <w:t xml:space="preserve">Lien du site : </w:t>
+      </w:r>
+      <w:hyperlink r:id="rId7" w:history="1">
+        <w:r>
+          <w:rPr>
+            <w:rStyle w:val="Lienhypertexte"/>
+            <w:sz w:val="24"/>
+          </w:rPr>
+          <w:t>https://equitus-cdp.vercel.app/</w:t>
+        </w:r>
+      </w:hyperlink>
     </w:p>
     <w:p>
       <w:pPr>
@@ -1011,11 +1026,10 @@
         </w:rPr>
         <w:t xml:space="preserve"> </w:t>
       </w:r>
-      <w:hyperlink r:id="rId7" w:history="1">
+      <w:hyperlink r:id="rId8" w:history="1">
         <w:r>
           <w:rPr>
             <w:rStyle w:val="Lienhypertexte"/>
-            <w:color w:val="auto"/>
             <w:spacing w:val="3"/>
             <w:w w:val="105"/>
             <w:sz w:val="24"/>
@@ -6343,7 +6357,7 @@
       </w:r>
     </w:p>
     <w:sectPr>
-      <w:footerReference w:type="default" r:id="rId8"/>
+      <w:footerReference w:type="default" r:id="rId9"/>
       <w:pgSz w:w="12240" w:h="15840"/>
       <w:pgMar w:top="1300" w:right="1080" w:bottom="1020" w:left="1080" w:header="0" w:footer="822" w:gutter="0"/>
       <w:cols w:space="720"/>

</xml_diff>